<commit_message>
Log in with email instead of username
Users register and log in with a unique, case-insensitive email address.
The migration renames the existing column, so existing rows are kept.
Seed, Swagger, tests and the Hebrew guides are updated accordingly.

Co-Authored-By: Claude Opus 5.5 <noreply@anthropic.com>
</commit_message>
<xml_diff>
--- a/docs/spec.docx
+++ b/docs/spec.docx
@@ -240,6 +240,32 @@
           <w:rtl/>
         </w:rPr>
         <w:t xml:space="preserve"> שם לקבוצה חדשה. הכול נשמר יחד, או שלא נשמר כלום.</w:t>
+      </w:r>
+    </w:p>
+    <w:p>
+      <w:pPr>
+        <w:pStyle w:val="ListParagraph"/>
+        <w:numPr>
+          <w:ilvl w:val="0"/>
+          <w:numId w:val="2"/>
+        </w:numPr>
+        <w:bidi/>
+        <w:spacing w:after="60"/>
+        <w:jc w:val="right"/>
+      </w:pPr>
+      <w:r>
+        <w:rPr>
+          <w:b/>
+          <w:bCs/>
+          <w:rtl/>
+        </w:rPr>
+        <w:t xml:space="preserve">הכניסה היא עם כתובת מייל וסיסמה.</w:t>
+      </w:r>
+      <w:r>
+        <w:rPr>
+          <w:rtl/>
+        </w:rPr>
+        <w:t xml:space="preserve"> המייל ייחודי, ואין הבדל בין אותיות גדולות לקטנות. האתר לא שולח מיילים, ולכן אין אימות מייל ואין שחזור סיסמה.</w:t>
       </w:r>
     </w:p>
     <w:p>
@@ -1135,7 +1161,7 @@
                 <w:szCs w:val="20"/>
                 <w:rtl/>
               </w:rPr>
-              <w:t xml:space="preserve">טופס: שם משתמש וסיסמה. קישור להרשמה.</w:t>
+              <w:t xml:space="preserve">טופס: כתובת מייל וסיסמה. קישור להרשמה.</w:t>
             </w:r>
           </w:p>
         </w:tc>
@@ -1244,7 +1270,7 @@
                 <w:szCs w:val="20"/>
                 <w:rtl/>
               </w:rPr>
-              <w:t xml:space="preserve">שם משתמש, סיסמה, אימות סיסמה, שם תצוגה, בחירת אווטאר (רשת של 30), ובחירה: "יש לי קוד" (שדה קוד) או "קבוצה חדשה" (שדה שם קבוצה). אפשר לחלק לשני שלבים בטופס.</w:t>
+              <w:t xml:space="preserve">כתובת מייל, סיסמה, אימות סיסמה, שם תצוגה, בחירת אווטאר (רשת של 30), ובחירה: "יש לי קוד" (שדה קוד) או "קבוצה חדשה" (שדה שם קבוצה). אפשר לחלק לשני שלבים בטופס.</w:t>
             </w:r>
           </w:p>
         </w:tc>
@@ -1275,7 +1301,7 @@
                 <w:szCs w:val="20"/>
                 <w:rtl/>
               </w:rPr>
-              <w:t xml:space="preserve">להירשם. שגיאות ליד השדה: שם משתמש תפוס, קוד לא נמצא.</w:t>
+              <w:t xml:space="preserve">להירשם. שגיאות ליד השדה: המייל כבר רשום, קוד לא נמצא.</w:t>
             </w:r>
           </w:p>
         </w:tc>
@@ -1775,7 +1801,7 @@
                 <w:szCs w:val="20"/>
                 <w:rtl/>
               </w:rPr>
-              <w:t xml:space="preserve">סרגל עליון: שם הקבוצה, שם המשתמש והאווטאר, קישורים, התנתקות. סטריפ תחתון: משפט ההשראה היומי.</w:t>
+              <w:t xml:space="preserve">סרגל עליון: שם הקבוצה, שם התצוגה והאווטאר, קישורים, התנתקות. סטריפ תחתון: משפט ההשראה היומי.</w:t>
             </w:r>
           </w:p>
         </w:tc>
@@ -4581,7 +4607,7 @@
                 <w:szCs w:val="20"/>
                 <w:rtl/>
               </w:rPr>
-              <w:t xml:space="preserve">username</w:t>
+              <w:t xml:space="preserve">email</w:t>
             </w:r>
           </w:p>
         </w:tc>
@@ -4674,7 +4700,7 @@
                 <w:szCs w:val="20"/>
                 <w:rtl/>
               </w:rPr>
-              <w:t xml:space="preserve">ייחודי. 3–20 תווים: אותיות באנגלית, ספרות וקו תחתון. נשמר באותיות קטנות</w:t>
+              <w:t xml:space="preserve">ייחודי. כתובת מייל תקינה, עד 254 תווים. משמשת לכניסה. נשמרת באותיות קטנות (Noa@Mail.com = noa@mail.com)</w:t>
             </w:r>
           </w:p>
         </w:tc>
@@ -9617,7 +9643,7 @@
                 <w:szCs w:val="20"/>
                 <w:rtl/>
               </w:rPr>
-              <w:t xml:space="preserve">שם משתמש תפוס, קוד הצטרפות תפוס, כבר הצטרף, כבר דווח על היום הזה</w:t>
+              <w:t xml:space="preserve">המייל כבר רשום, קוד הצטרפות תפוס, כבר הצטרף, כבר דווח על היום הזה</w:t>
             </w:r>
           </w:p>
         </w:tc>
@@ -10915,7 +10941,7 @@
           <w:sz w:val="18"/>
           <w:szCs w:val="18"/>
         </w:rPr>
-        <w:t xml:space="preserve">{ "username": "noa", "password": "Secret123",</w:t>
+        <w:t xml:space="preserve">{ "email": "noa@example.com", "password": "Secret123",</w:t>
       </w:r>
     </w:p>
     <w:p>
@@ -10994,7 +11020,7 @@
           <w:sz w:val="18"/>
           <w:szCs w:val="18"/>
         </w:rPr>
-        <w:t xml:space="preserve">201 { "token": "eyJhbGciOi...", "user": { "id": 7, "username": "noa", "displayName": "נועה",</w:t>
+        <w:t xml:space="preserve">201 { "token": "eyJhbGciOi...", "user": { "id": 7, "email": "noa@example.com", "displayName": "נועה",</w:t>
       </w:r>
     </w:p>
     <w:p>
@@ -11047,7 +11073,7 @@
         <w:rPr>
           <w:rtl/>
         </w:rPr>
-        <w:t xml:space="preserve"> 400 (סיסמה קצרה, שני השדות נשלחו או אף אחד מהם), 404 קוד לא נמצא (details על joinCode), 409 שם משתמש תפוס.</w:t>
+        <w:t xml:space="preserve"> 400 (סיסמה קצרה, שני השדות נשלחו או אף אחד מהם), 404 קוד לא נמצא (details על joinCode), 409 המייל כבר רשום.</w:t>
       </w:r>
     </w:p>
     <w:p>
@@ -11294,7 +11320,7 @@
         <w:rPr>
           <w:rtl/>
         </w:rPr>
-        <w:t xml:space="preserve">בודק שם משתמש וסיסמה ומחזיר Token בתוקף ל-24 שעות.</w:t>
+        <w:t xml:space="preserve">בודק כתובת מייל וסיסמה ומחזיר Token בתוקף ל-24 שעות.</w:t>
       </w:r>
     </w:p>
     <w:p>
@@ -11325,7 +11351,7 @@
           <w:sz w:val="18"/>
           <w:szCs w:val="18"/>
         </w:rPr>
-        <w:t xml:space="preserve">{ "username": "noa", "password": "Secret123" }</w:t>
+        <w:t xml:space="preserve">{ "email": "noa@example.com", "password": "Secret123" }</w:t>
       </w:r>
     </w:p>
     <w:p>
@@ -11356,7 +11382,7 @@
           <w:sz w:val="18"/>
           <w:szCs w:val="18"/>
         </w:rPr>
-        <w:t xml:space="preserve">200 { "token": "eyJhbGciOi...", "user": { "id": 7, "username": "noa", "displayName": "נועה",</w:t>
+        <w:t xml:space="preserve">200 { "token": "eyJhbGciOi...", "user": { "id": 7, "email": "noa@example.com", "displayName": "נועה",</w:t>
       </w:r>
     </w:p>
     <w:p>
@@ -11409,7 +11435,7 @@
         <w:rPr>
           <w:rtl/>
         </w:rPr>
-        <w:t xml:space="preserve"> 401 "שם משתמש או סיסמה שגויים" (בלי לגלות מה מהשניים שגוי).</w:t>
+        <w:t xml:space="preserve"> 401 "כתובת מייל או סיסמה שגויים" (בלי לגלות מה מהשניים שגוי).</w:t>
       </w:r>
     </w:p>
     <w:p>
@@ -11718,7 +11744,7 @@
           <w:sz w:val="18"/>
           <w:szCs w:val="18"/>
         </w:rPr>
-        <w:t xml:space="preserve">200 { "id": 7, "username": "noa", "displayName": "נועה",</w:t>
+        <w:t xml:space="preserve">200 { "id": 7, "email": "noa@example.com", "displayName": "נועה",</w:t>
       </w:r>
     </w:p>
     <w:p>

</xml_diff>